<commit_message>
Updated website for cleaner looks
</commit_message>
<xml_diff>
--- a/ArchOSC Assignment/Lab 2 Placeholder.docx
+++ b/ArchOSC Assignment/Lab 2 Placeholder.docx
@@ -79,6 +79,20 @@
       <w:r>
         <w:t>I have created a base for my portfolio website.</w:t>
       </w:r>
+    </w:p>
+    <w:p>
+      <w:r>
+        <w:t>Task 6</w:t>
+      </w:r>
+      <w:r>
+        <w:br/>
+        <w:t xml:space="preserve">I have tried to sync up from local as instructed however I ran into some errors and had to find a work around as shown in 006 </w:t>
+      </w:r>
+      <w:proofErr w:type="spellStart"/>
+      <w:r>
+        <w:t>png</w:t>
+      </w:r>
+      <w:proofErr w:type="spellEnd"/>
     </w:p>
     <w:sectPr>
       <w:pgSz w:w="12240" w:h="15840"/>
@@ -693,6 +707,7 @@
   <w:style w:type="character" w:default="1" w:styleId="DefaultParagraphFont">
     <w:name w:val="Default Paragraph Font"/>
     <w:uiPriority w:val="1"/>
+    <w:semiHidden/>
     <w:unhideWhenUsed/>
   </w:style>
   <w:style w:type="table" w:default="1" w:styleId="TableNormal">

</xml_diff>

<commit_message>
Improved website to zoom in picture
</commit_message>
<xml_diff>
--- a/ArchOSC Assignment/Lab 2 Placeholder.docx
+++ b/ArchOSC Assignment/Lab 2 Placeholder.docx
@@ -94,6 +94,84 @@
       </w:r>
       <w:proofErr w:type="spellEnd"/>
     </w:p>
+    <w:p>
+      <w:r>
+        <w:t>Task 7</w:t>
+      </w:r>
+      <w:r>
+        <w:br/>
+        <w:t>I have pushed the files in task 6… but did it again in task 7… bit confusing information given in the instructions…</w:t>
+      </w:r>
+    </w:p>
+    <w:p>
+      <w:r>
+        <w:t>Task 8</w:t>
+      </w:r>
+      <w:r>
+        <w:br/>
+      </w:r>
+      <w:r>
+        <w:t xml:space="preserve">I have improved my website to begin with </w:t>
+      </w:r>
+      <w:proofErr w:type="gramStart"/>
+      <w:r>
+        <w:t xml:space="preserve">since </w:t>
+      </w:r>
+      <w:proofErr w:type="spellStart"/>
+      <w:r>
+        <w:t>i</w:t>
+      </w:r>
+      <w:proofErr w:type="spellEnd"/>
+      <w:proofErr w:type="gramEnd"/>
+      <w:r>
+        <w:t xml:space="preserve"> have restarted this task </w:t>
+      </w:r>
+      <w:proofErr w:type="gramStart"/>
+      <w:r>
+        <w:t>half way</w:t>
+      </w:r>
+      <w:proofErr w:type="gramEnd"/>
+      <w:r>
+        <w:t xml:space="preserve"> through </w:t>
+      </w:r>
+      <w:proofErr w:type="gramStart"/>
+      <w:r>
+        <w:t xml:space="preserve">meaning </w:t>
+      </w:r>
+      <w:proofErr w:type="spellStart"/>
+      <w:r>
+        <w:t>i</w:t>
+      </w:r>
+      <w:proofErr w:type="spellEnd"/>
+      <w:proofErr w:type="gramEnd"/>
+      <w:r>
+        <w:t xml:space="preserve"> reused some code from previous attempts.</w:t>
+      </w:r>
+      <w:r>
+        <w:br/>
+      </w:r>
+      <w:r>
+        <w:t>Basically</w:t>
+      </w:r>
+      <w:r>
+        <w:t xml:space="preserve">, all </w:t>
+      </w:r>
+      <w:r>
+        <w:t>I</w:t>
+      </w:r>
+      <w:r>
+        <w:t xml:space="preserve"> have done is add multiple sites and buttons to navigate through them. I have also added a dark mode that stays ON </w:t>
+      </w:r>
+      <w:proofErr w:type="spellStart"/>
+      <w:r>
+        <w:t>on</w:t>
+      </w:r>
+      <w:proofErr w:type="spellEnd"/>
+      <w:r>
+        <w:t xml:space="preserve"> all pages. And I have set everything up so that I can add infinite websites using script and style as reference without needing to recreate the entire structure.</w:t>
+      </w:r>
+    </w:p>
+    <w:p/>
     <w:sectPr>
       <w:pgSz w:w="12240" w:h="15840"/>
       <w:pgMar w:top="1440" w:right="1440" w:bottom="1440" w:left="1440" w:header="720" w:footer="720" w:gutter="0"/>
@@ -707,7 +785,6 @@
   <w:style w:type="character" w:default="1" w:styleId="DefaultParagraphFont">
     <w:name w:val="Default Paragraph Font"/>
     <w:uiPriority w:val="1"/>
-    <w:semiHidden/>
     <w:unhideWhenUsed/>
   </w:style>
   <w:style w:type="table" w:default="1" w:styleId="TableNormal">

</xml_diff>